<commit_message>
Capturas del juego en el documento del Producto 2
</commit_message>
<xml_diff>
--- a/Documentacion/Producto2/PérezAlcántaraAlejandro_producto2_10D.docx
+++ b/Documentacion/Producto2/PérezAlcántaraAlejandro_producto2_10D.docx
@@ -2120,7 +2120,7 @@
                 <w:sz w:val="22"/>
                 <w:szCs w:val="22"/>
               </w:rPr>
-              <w:t xml:space="preserve">4.4 Interfaces implementadas</w:t>
+              <w:t xml:space="preserve">4.4 Interfaces y mecánicas en el juego</w:t>
             </w:r>
             <w:r>
               <w:rPr>
@@ -2194,7 +2194,7 @@
                 <w:sz w:val="22"/>
                 <w:szCs w:val="22"/>
               </w:rPr>
-              <w:t xml:space="preserve">4.5 Habilidades elementales y acertijos</w:t>
+              <w:t xml:space="preserve">4.5 Interfaces implementadas</w:t>
             </w:r>
             <w:r>
               <w:rPr>
@@ -2239,7 +2239,7 @@
                 <w:sz w:val="22"/>
                 <w:szCs w:val="22"/>
               </w:rPr>
-              <w:t>18</w:t>
+              <w:t>19</w:t>
             </w:r>
             <w:r>
               <w:rPr>
@@ -2268,7 +2268,7 @@
                 <w:sz w:val="22"/>
                 <w:szCs w:val="22"/>
               </w:rPr>
-              <w:t xml:space="preserve">4.6 Audio</w:t>
+              <w:t xml:space="preserve">4.6 Habilidades elementales y acertijos</w:t>
             </w:r>
             <w:r>
               <w:rPr>
@@ -2313,7 +2313,7 @@
                 <w:sz w:val="22"/>
                 <w:szCs w:val="22"/>
               </w:rPr>
-              <w:t>18</w:t>
+              <w:t>20</w:t>
             </w:r>
             <w:r>
               <w:rPr>
@@ -2342,7 +2342,7 @@
                 <w:sz w:val="22"/>
                 <w:szCs w:val="22"/>
               </w:rPr>
-              <w:t xml:space="preserve">4.7 Herramientas de editor</w:t>
+              <w:t xml:space="preserve">4.7 Audio</w:t>
             </w:r>
             <w:r>
               <w:rPr>
@@ -2387,7 +2387,81 @@
                 <w:sz w:val="22"/>
                 <w:szCs w:val="22"/>
               </w:rPr>
-              <w:t>19</w:t>
+              <w:t>20</w:t>
+            </w:r>
+            <w:r>
+              <w:rPr>
+                <w:rFonts w:ascii="Arial Black" w:hAnsi="Arial Black"/>
+                <w:noProof/>
+                <w:sz w:val="22"/>
+                <w:szCs w:val="22"/>
+              </w:rPr>
+              <w:fldChar w:fldCharType="end"/>
+            </w:r>
+          </w:hyperlink>
+        </w:p>
+        <w:p>
+          <w:pPr>
+            <w:pStyle w:val="TDC2"/>
+            <w:tabs>
+              <w:tab w:val="right" w:leader="dot" w:pos="9350"/>
+            </w:tabs>
+          </w:pPr>
+          <w:hyperlink w:anchor="_TocP2022" w:history="1">
+            <w:r>
+              <w:rPr>
+                <w:rStyle w:val="Hipervnculo"/>
+                <w:rFonts w:ascii="Arial Black" w:hAnsi="Arial Black" w:cs="Arial"/>
+                <w:noProof/>
+                <w:sz w:val="22"/>
+                <w:szCs w:val="22"/>
+              </w:rPr>
+              <w:t xml:space="preserve">4.8 Herramientas de editor</w:t>
+            </w:r>
+            <w:r>
+              <w:rPr>
+                <w:rFonts w:ascii="Arial Black" w:hAnsi="Arial Black"/>
+                <w:noProof/>
+                <w:sz w:val="22"/>
+                <w:szCs w:val="22"/>
+              </w:rPr>
+              <w:tab/>
+            </w:r>
+            <w:r>
+              <w:rPr>
+                <w:rFonts w:ascii="Arial Black" w:hAnsi="Arial Black"/>
+                <w:noProof/>
+                <w:sz w:val="22"/>
+                <w:szCs w:val="22"/>
+              </w:rPr>
+              <w:fldChar w:fldCharType="begin"/>
+            </w:r>
+            <w:r>
+              <w:rPr>
+                <w:rFonts w:ascii="Arial Black" w:hAnsi="Arial Black"/>
+                <w:noProof/>
+                <w:sz w:val="22"/>
+                <w:szCs w:val="22"/>
+              </w:rPr>
+              <w:instrText xml:space="preserve"> PAGEREF _TocP2022 \h </w:instrText>
+            </w:r>
+            <w:r>
+              <w:rPr>
+                <w:rFonts w:ascii="Arial Black" w:hAnsi="Arial Black"/>
+                <w:noProof/>
+                <w:sz w:val="22"/>
+                <w:szCs w:val="22"/>
+              </w:rPr>
+              <w:fldChar w:fldCharType="separate"/>
+            </w:r>
+            <w:r>
+              <w:rPr>
+                <w:rFonts w:ascii="Arial Black" w:hAnsi="Arial Black"/>
+                <w:noProof/>
+                <w:sz w:val="22"/>
+                <w:szCs w:val="22"/>
+              </w:rPr>
+              <w:t>21</w:t>
             </w:r>
             <w:r>
               <w:rPr>
@@ -2407,7 +2481,7 @@
               <w:tab w:val="right" w:leader="dot" w:pos="9350"/>
             </w:tabs>
           </w:pPr>
-          <w:hyperlink w:anchor="_TocP2022" w:history="1">
+          <w:hyperlink w:anchor="_TocP2023" w:history="1">
             <w:r>
               <w:rPr>
                 <w:rStyle w:val="Hipervnculo"/>
@@ -2443,7 +2517,7 @@
                 <w:sz w:val="24"/>
                 <w:szCs w:val="24"/>
               </w:rPr>
-              <w:instrText xml:space="preserve"> PAGEREF _TocP2022 \h </w:instrText>
+              <w:instrText xml:space="preserve"> PAGEREF _TocP2023 \h </w:instrText>
             </w:r>
             <w:r>
               <w:rPr>
@@ -2461,7 +2535,7 @@
                 <w:sz w:val="24"/>
                 <w:szCs w:val="24"/>
               </w:rPr>
-              <w:t>19</w:t>
+              <w:t>21</w:t>
             </w:r>
             <w:r>
               <w:rPr>
@@ -2469,80 +2543,6 @@
                 <w:noProof/>
                 <w:sz w:val="24"/>
                 <w:szCs w:val="24"/>
-              </w:rPr>
-              <w:fldChar w:fldCharType="end"/>
-            </w:r>
-          </w:hyperlink>
-        </w:p>
-        <w:p>
-          <w:pPr>
-            <w:pStyle w:val="TDC2"/>
-            <w:tabs>
-              <w:tab w:val="right" w:leader="dot" w:pos="9350"/>
-            </w:tabs>
-          </w:pPr>
-          <w:hyperlink w:anchor="_TocP2023" w:history="1">
-            <w:r>
-              <w:rPr>
-                <w:rStyle w:val="Hipervnculo"/>
-                <w:rFonts w:ascii="Arial Black" w:hAnsi="Arial Black" w:cs="Arial"/>
-                <w:noProof/>
-                <w:sz w:val="22"/>
-                <w:szCs w:val="22"/>
-              </w:rPr>
-              <w:t xml:space="preserve">5.1 Casos de prueba</w:t>
-            </w:r>
-            <w:r>
-              <w:rPr>
-                <w:rFonts w:ascii="Arial Black" w:hAnsi="Arial Black"/>
-                <w:noProof/>
-                <w:sz w:val="22"/>
-                <w:szCs w:val="22"/>
-              </w:rPr>
-              <w:tab/>
-            </w:r>
-            <w:r>
-              <w:rPr>
-                <w:rFonts w:ascii="Arial Black" w:hAnsi="Arial Black"/>
-                <w:noProof/>
-                <w:sz w:val="22"/>
-                <w:szCs w:val="22"/>
-              </w:rPr>
-              <w:fldChar w:fldCharType="begin"/>
-            </w:r>
-            <w:r>
-              <w:rPr>
-                <w:rFonts w:ascii="Arial Black" w:hAnsi="Arial Black"/>
-                <w:noProof/>
-                <w:sz w:val="22"/>
-                <w:szCs w:val="22"/>
-              </w:rPr>
-              <w:instrText xml:space="preserve"> PAGEREF _TocP2023 \h </w:instrText>
-            </w:r>
-            <w:r>
-              <w:rPr>
-                <w:rFonts w:ascii="Arial Black" w:hAnsi="Arial Black"/>
-                <w:noProof/>
-                <w:sz w:val="22"/>
-                <w:szCs w:val="22"/>
-              </w:rPr>
-              <w:fldChar w:fldCharType="separate"/>
-            </w:r>
-            <w:r>
-              <w:rPr>
-                <w:rFonts w:ascii="Arial Black" w:hAnsi="Arial Black"/>
-                <w:noProof/>
-                <w:sz w:val="22"/>
-                <w:szCs w:val="22"/>
-              </w:rPr>
-              <w:t>19</w:t>
-            </w:r>
-            <w:r>
-              <w:rPr>
-                <w:rFonts w:ascii="Arial Black" w:hAnsi="Arial Black"/>
-                <w:noProof/>
-                <w:sz w:val="22"/>
-                <w:szCs w:val="22"/>
               </w:rPr>
               <w:fldChar w:fldCharType="end"/>
             </w:r>
@@ -2564,7 +2564,7 @@
                 <w:sz w:val="22"/>
                 <w:szCs w:val="22"/>
               </w:rPr>
-              <w:t xml:space="preserve">5.2 Buglist</w:t>
+              <w:t xml:space="preserve">5.1 Casos de prueba</w:t>
             </w:r>
             <w:r>
               <w:rPr>
@@ -2609,7 +2609,7 @@
                 <w:sz w:val="22"/>
                 <w:szCs w:val="22"/>
               </w:rPr>
-              <w:t>20</w:t>
+              <w:t>21</w:t>
             </w:r>
             <w:r>
               <w:rPr>
@@ -2624,7 +2624,7 @@
         </w:p>
         <w:p>
           <w:pPr>
-            <w:pStyle w:val="TDC1"/>
+            <w:pStyle w:val="TDC2"/>
             <w:tabs>
               <w:tab w:val="right" w:leader="dot" w:pos="9350"/>
             </w:tabs>
@@ -2635,17 +2635,17 @@
                 <w:rStyle w:val="Hipervnculo"/>
                 <w:rFonts w:ascii="Arial Black" w:hAnsi="Arial Black" w:cs="Arial"/>
                 <w:noProof/>
-                <w:sz w:val="24"/>
-                <w:szCs w:val="24"/>
-              </w:rPr>
-              <w:t xml:space="preserve">6. Sprint Review</w:t>
+                <w:sz w:val="22"/>
+                <w:szCs w:val="22"/>
+              </w:rPr>
+              <w:t xml:space="preserve">5.2 Buglist</w:t>
             </w:r>
             <w:r>
               <w:rPr>
                 <w:rFonts w:ascii="Arial Black" w:hAnsi="Arial Black"/>
                 <w:noProof/>
-                <w:sz w:val="24"/>
-                <w:szCs w:val="24"/>
+                <w:sz w:val="22"/>
+                <w:szCs w:val="22"/>
               </w:rPr>
               <w:tab/>
             </w:r>
@@ -2653,8 +2653,8 @@
               <w:rPr>
                 <w:rFonts w:ascii="Arial Black" w:hAnsi="Arial Black"/>
                 <w:noProof/>
-                <w:sz w:val="24"/>
-                <w:szCs w:val="24"/>
+                <w:sz w:val="22"/>
+                <w:szCs w:val="22"/>
               </w:rPr>
               <w:fldChar w:fldCharType="begin"/>
             </w:r>
@@ -2662,8 +2662,8 @@
               <w:rPr>
                 <w:rFonts w:ascii="Arial Black" w:hAnsi="Arial Black"/>
                 <w:noProof/>
-                <w:sz w:val="24"/>
-                <w:szCs w:val="24"/>
+                <w:sz w:val="22"/>
+                <w:szCs w:val="22"/>
               </w:rPr>
               <w:instrText xml:space="preserve"> PAGEREF _TocP2025 \h </w:instrText>
             </w:r>
@@ -2671,8 +2671,8 @@
               <w:rPr>
                 <w:rFonts w:ascii="Arial Black" w:hAnsi="Arial Black"/>
                 <w:noProof/>
-                <w:sz w:val="24"/>
-                <w:szCs w:val="24"/>
+                <w:sz w:val="22"/>
+                <w:szCs w:val="22"/>
               </w:rPr>
               <w:fldChar w:fldCharType="separate"/>
             </w:r>
@@ -2680,17 +2680,17 @@
               <w:rPr>
                 <w:rFonts w:ascii="Arial Black" w:hAnsi="Arial Black"/>
                 <w:noProof/>
-                <w:sz w:val="24"/>
-                <w:szCs w:val="24"/>
-              </w:rPr>
-              <w:t>21</w:t>
+                <w:sz w:val="22"/>
+                <w:szCs w:val="22"/>
+              </w:rPr>
+              <w:t>22</w:t>
             </w:r>
             <w:r>
               <w:rPr>
                 <w:rFonts w:ascii="Arial Black" w:hAnsi="Arial Black"/>
                 <w:noProof/>
-                <w:sz w:val="24"/>
-                <w:szCs w:val="24"/>
+                <w:sz w:val="22"/>
+                <w:szCs w:val="22"/>
               </w:rPr>
               <w:fldChar w:fldCharType="end"/>
             </w:r>
@@ -2712,7 +2712,7 @@
                 <w:sz w:val="24"/>
                 <w:szCs w:val="24"/>
               </w:rPr>
-              <w:t xml:space="preserve">7. Presupuesto y licencia</w:t>
+              <w:t xml:space="preserve">6. Sprint Review</w:t>
             </w:r>
             <w:r>
               <w:rPr>
@@ -2757,7 +2757,7 @@
                 <w:sz w:val="24"/>
                 <w:szCs w:val="24"/>
               </w:rPr>
-              <w:t>21</w:t>
+              <w:t>23</w:t>
             </w:r>
             <w:r>
               <w:rPr>
@@ -2772,7 +2772,7 @@
         </w:p>
         <w:p>
           <w:pPr>
-            <w:pStyle w:val="TDC2"/>
+            <w:pStyle w:val="TDC1"/>
             <w:tabs>
               <w:tab w:val="right" w:leader="dot" w:pos="9350"/>
             </w:tabs>
@@ -2783,17 +2783,17 @@
                 <w:rStyle w:val="Hipervnculo"/>
                 <w:rFonts w:ascii="Arial Black" w:hAnsi="Arial Black" w:cs="Arial"/>
                 <w:noProof/>
-                <w:sz w:val="22"/>
-                <w:szCs w:val="22"/>
-              </w:rPr>
-              <w:t xml:space="preserve">7.1 Presupuesto</w:t>
+                <w:sz w:val="24"/>
+                <w:szCs w:val="24"/>
+              </w:rPr>
+              <w:t xml:space="preserve">7. Presupuesto y licencia</w:t>
             </w:r>
             <w:r>
               <w:rPr>
                 <w:rFonts w:ascii="Arial Black" w:hAnsi="Arial Black"/>
                 <w:noProof/>
-                <w:sz w:val="22"/>
-                <w:szCs w:val="22"/>
+                <w:sz w:val="24"/>
+                <w:szCs w:val="24"/>
               </w:rPr>
               <w:tab/>
             </w:r>
@@ -2801,8 +2801,8 @@
               <w:rPr>
                 <w:rFonts w:ascii="Arial Black" w:hAnsi="Arial Black"/>
                 <w:noProof/>
-                <w:sz w:val="22"/>
-                <w:szCs w:val="22"/>
+                <w:sz w:val="24"/>
+                <w:szCs w:val="24"/>
               </w:rPr>
               <w:fldChar w:fldCharType="begin"/>
             </w:r>
@@ -2810,8 +2810,8 @@
               <w:rPr>
                 <w:rFonts w:ascii="Arial Black" w:hAnsi="Arial Black"/>
                 <w:noProof/>
-                <w:sz w:val="22"/>
-                <w:szCs w:val="22"/>
+                <w:sz w:val="24"/>
+                <w:szCs w:val="24"/>
               </w:rPr>
               <w:instrText xml:space="preserve"> PAGEREF _TocP2027 \h </w:instrText>
             </w:r>
@@ -2819,8 +2819,8 @@
               <w:rPr>
                 <w:rFonts w:ascii="Arial Black" w:hAnsi="Arial Black"/>
                 <w:noProof/>
-                <w:sz w:val="22"/>
-                <w:szCs w:val="22"/>
+                <w:sz w:val="24"/>
+                <w:szCs w:val="24"/>
               </w:rPr>
               <w:fldChar w:fldCharType="separate"/>
             </w:r>
@@ -2828,17 +2828,17 @@
               <w:rPr>
                 <w:rFonts w:ascii="Arial Black" w:hAnsi="Arial Black"/>
                 <w:noProof/>
-                <w:sz w:val="22"/>
-                <w:szCs w:val="22"/>
-              </w:rPr>
-              <w:t>21</w:t>
+                <w:sz w:val="24"/>
+                <w:szCs w:val="24"/>
+              </w:rPr>
+              <w:t>23</w:t>
             </w:r>
             <w:r>
               <w:rPr>
                 <w:rFonts w:ascii="Arial Black" w:hAnsi="Arial Black"/>
                 <w:noProof/>
-                <w:sz w:val="22"/>
-                <w:szCs w:val="22"/>
+                <w:sz w:val="24"/>
+                <w:szCs w:val="24"/>
               </w:rPr>
               <w:fldChar w:fldCharType="end"/>
             </w:r>
@@ -2860,7 +2860,7 @@
                 <w:sz w:val="22"/>
                 <w:szCs w:val="22"/>
               </w:rPr>
-              <w:t xml:space="preserve">7.2 Licencia y propiedad intelectual</w:t>
+              <w:t xml:space="preserve">7.1 Presupuesto</w:t>
             </w:r>
             <w:r>
               <w:rPr>
@@ -2905,7 +2905,7 @@
                 <w:sz w:val="22"/>
                 <w:szCs w:val="22"/>
               </w:rPr>
-              <w:t>22</w:t>
+              <w:t>23</w:t>
             </w:r>
             <w:r>
               <w:rPr>
@@ -2920,7 +2920,7 @@
         </w:p>
         <w:p>
           <w:pPr>
-            <w:pStyle w:val="TDC1"/>
+            <w:pStyle w:val="TDC2"/>
             <w:tabs>
               <w:tab w:val="right" w:leader="dot" w:pos="9350"/>
             </w:tabs>
@@ -2931,17 +2931,17 @@
                 <w:rStyle w:val="Hipervnculo"/>
                 <w:rFonts w:ascii="Arial Black" w:hAnsi="Arial Black" w:cs="Arial"/>
                 <w:noProof/>
-                <w:sz w:val="24"/>
-                <w:szCs w:val="24"/>
-              </w:rPr>
-              <w:t xml:space="preserve">8. Plan para el Sprint 3</w:t>
+                <w:sz w:val="22"/>
+                <w:szCs w:val="22"/>
+              </w:rPr>
+              <w:t xml:space="preserve">7.2 Licencia y propiedad intelectual</w:t>
             </w:r>
             <w:r>
               <w:rPr>
                 <w:rFonts w:ascii="Arial Black" w:hAnsi="Arial Black"/>
                 <w:noProof/>
-                <w:sz w:val="24"/>
-                <w:szCs w:val="24"/>
+                <w:sz w:val="22"/>
+                <w:szCs w:val="22"/>
               </w:rPr>
               <w:tab/>
             </w:r>
@@ -2949,8 +2949,8 @@
               <w:rPr>
                 <w:rFonts w:ascii="Arial Black" w:hAnsi="Arial Black"/>
                 <w:noProof/>
-                <w:sz w:val="24"/>
-                <w:szCs w:val="24"/>
+                <w:sz w:val="22"/>
+                <w:szCs w:val="22"/>
               </w:rPr>
               <w:fldChar w:fldCharType="begin"/>
             </w:r>
@@ -2958,8 +2958,8 @@
               <w:rPr>
                 <w:rFonts w:ascii="Arial Black" w:hAnsi="Arial Black"/>
                 <w:noProof/>
-                <w:sz w:val="24"/>
-                <w:szCs w:val="24"/>
+                <w:sz w:val="22"/>
+                <w:szCs w:val="22"/>
               </w:rPr>
               <w:instrText xml:space="preserve"> PAGEREF _TocP2029 \h </w:instrText>
             </w:r>
@@ -2967,8 +2967,8 @@
               <w:rPr>
                 <w:rFonts w:ascii="Arial Black" w:hAnsi="Arial Black"/>
                 <w:noProof/>
-                <w:sz w:val="24"/>
-                <w:szCs w:val="24"/>
+                <w:sz w:val="22"/>
+                <w:szCs w:val="22"/>
               </w:rPr>
               <w:fldChar w:fldCharType="separate"/>
             </w:r>
@@ -2976,17 +2976,17 @@
               <w:rPr>
                 <w:rFonts w:ascii="Arial Black" w:hAnsi="Arial Black"/>
                 <w:noProof/>
-                <w:sz w:val="24"/>
-                <w:szCs w:val="24"/>
-              </w:rPr>
-              <w:t>22</w:t>
+                <w:sz w:val="22"/>
+                <w:szCs w:val="22"/>
+              </w:rPr>
+              <w:t>24</w:t>
             </w:r>
             <w:r>
               <w:rPr>
                 <w:rFonts w:ascii="Arial Black" w:hAnsi="Arial Black"/>
                 <w:noProof/>
-                <w:sz w:val="24"/>
-                <w:szCs w:val="24"/>
+                <w:sz w:val="22"/>
+                <w:szCs w:val="22"/>
               </w:rPr>
               <w:fldChar w:fldCharType="end"/>
             </w:r>
@@ -3008,7 +3008,7 @@
                 <w:sz w:val="24"/>
                 <w:szCs w:val="24"/>
               </w:rPr>
-              <w:t xml:space="preserve">Conclusión</w:t>
+              <w:t xml:space="preserve">8. Plan para el Sprint 3</w:t>
             </w:r>
             <w:r>
               <w:rPr>
@@ -3053,7 +3053,7 @@
                 <w:sz w:val="24"/>
                 <w:szCs w:val="24"/>
               </w:rPr>
-              <w:t>22</w:t>
+              <w:t>24</w:t>
             </w:r>
             <w:r>
               <w:rPr>
@@ -3082,7 +3082,7 @@
                 <w:sz w:val="24"/>
                 <w:szCs w:val="24"/>
               </w:rPr>
-              <w:t xml:space="preserve">Referencias</w:t>
+              <w:t xml:space="preserve">Conclusión</w:t>
             </w:r>
             <w:r>
               <w:rPr>
@@ -3127,7 +3127,81 @@
                 <w:sz w:val="24"/>
                 <w:szCs w:val="24"/>
               </w:rPr>
-              <w:t>23</w:t>
+              <w:t>24</w:t>
+            </w:r>
+            <w:r>
+              <w:rPr>
+                <w:rFonts w:ascii="Arial Black" w:hAnsi="Arial Black"/>
+                <w:noProof/>
+                <w:sz w:val="24"/>
+                <w:szCs w:val="24"/>
+              </w:rPr>
+              <w:fldChar w:fldCharType="end"/>
+            </w:r>
+          </w:hyperlink>
+        </w:p>
+        <w:p>
+          <w:pPr>
+            <w:pStyle w:val="TDC1"/>
+            <w:tabs>
+              <w:tab w:val="right" w:leader="dot" w:pos="9350"/>
+            </w:tabs>
+          </w:pPr>
+          <w:hyperlink w:anchor="_TocP2032" w:history="1">
+            <w:r>
+              <w:rPr>
+                <w:rStyle w:val="Hipervnculo"/>
+                <w:rFonts w:ascii="Arial Black" w:hAnsi="Arial Black" w:cs="Arial"/>
+                <w:noProof/>
+                <w:sz w:val="24"/>
+                <w:szCs w:val="24"/>
+              </w:rPr>
+              <w:t xml:space="preserve">Referencias</w:t>
+            </w:r>
+            <w:r>
+              <w:rPr>
+                <w:rFonts w:ascii="Arial Black" w:hAnsi="Arial Black"/>
+                <w:noProof/>
+                <w:sz w:val="24"/>
+                <w:szCs w:val="24"/>
+              </w:rPr>
+              <w:tab/>
+            </w:r>
+            <w:r>
+              <w:rPr>
+                <w:rFonts w:ascii="Arial Black" w:hAnsi="Arial Black"/>
+                <w:noProof/>
+                <w:sz w:val="24"/>
+                <w:szCs w:val="24"/>
+              </w:rPr>
+              <w:fldChar w:fldCharType="begin"/>
+            </w:r>
+            <w:r>
+              <w:rPr>
+                <w:rFonts w:ascii="Arial Black" w:hAnsi="Arial Black"/>
+                <w:noProof/>
+                <w:sz w:val="24"/>
+                <w:szCs w:val="24"/>
+              </w:rPr>
+              <w:instrText xml:space="preserve"> PAGEREF _TocP2032 \h </w:instrText>
+            </w:r>
+            <w:r>
+              <w:rPr>
+                <w:rFonts w:ascii="Arial Black" w:hAnsi="Arial Black"/>
+                <w:noProof/>
+                <w:sz w:val="24"/>
+                <w:szCs w:val="24"/>
+              </w:rPr>
+              <w:fldChar w:fldCharType="separate"/>
+            </w:r>
+            <w:r>
+              <w:rPr>
+                <w:rFonts w:ascii="Arial Black" w:hAnsi="Arial Black"/>
+                <w:noProof/>
+                <w:sz w:val="24"/>
+                <w:szCs w:val="24"/>
+              </w:rPr>
+              <w:t>24</w:t>
             </w:r>
             <w:r>
               <w:rPr>
@@ -22636,9 +22710,805 @@
           <w:sz w:val="28"/>
           <w:szCs w:val="28"/>
         </w:rPr>
-        <w:t>4.4 Interfaces implementadas</w:t>
+        <w:t>4.4 Interfaces y mecánicas en el juego</w:t>
       </w:r>
       <w:bookmarkEnd w:id="918"/>
+    </w:p>
+    <w:p>
+      <w:pPr>
+        <w:spacing w:before="120" w:after="180" w:line="276" w:lineRule="auto"/>
+        <w:jc w:val="both"/>
+      </w:pPr>
+      <w:r>
+        <w:rPr>
+          <w:rFonts w:ascii="Arial" w:hAnsi="Arial" w:cs="Arial"/>
+          <w:color w:val="000000"/>
+          <w:sz w:val="24"/>
+          <w:szCs w:val="24"/>
+        </w:rPr>
+        <w:t xml:space="preserve">Las siguientes capturas las tomé jugando el Sprint 2 con el control de PS4, desde el prólogo hasta el Ala de Hielo.</w:t>
+      </w:r>
+    </w:p>
+    <w:p xmlns:a="http://schemas.openxmlformats.org/drawingml/2006/main" xmlns:pic="http://schemas.openxmlformats.org/drawingml/2006/picture">
+      <w:pPr>
+        <w:keepNext/>
+        <w:spacing w:before="120" w:after="0"/>
+        <w:jc w:val="center"/>
+      </w:pPr>
+      <w:r>
+        <w:drawing>
+          <wp:inline distT="0" distB="0" distL="57150" distR="57150">
+            <wp:extent cx="2816000" cy="1584000"/>
+            <wp:docPr id="515" name="Imagen 515"/>
+            <wp:cNvGraphicFramePr>
+              <a:graphicFrameLocks noChangeAspect="1"/>
+            </wp:cNvGraphicFramePr>
+            <a:graphic>
+              <a:graphicData uri="http://schemas.openxmlformats.org/drawingml/2006/picture">
+                <pic:pic>
+                  <pic:nvPicPr>
+                    <pic:cNvPr id="515" name="p2_915.jpeg"/>
+                    <pic:cNvPicPr/>
+                  </pic:nvPicPr>
+                  <pic:blipFill>
+                    <a:blip r:embed="rIdP2915"/>
+                    <a:stretch>
+                      <a:fillRect/>
+                    </a:stretch>
+                  </pic:blipFill>
+                  <pic:spPr>
+                    <a:xfrm>
+                      <a:off x="0" y="0"/>
+                      <a:ext cx="2816000" cy="1584000"/>
+                    </a:xfrm>
+                    <a:prstGeom prst="rect">
+                      <a:avLst/>
+                    </a:prstGeom>
+                  </pic:spPr>
+                </pic:pic>
+              </a:graphicData>
+            </a:graphic>
+          </wp:inline>
+        </w:drawing>
+      </w:r>
+      <w:r>
+        <w:drawing>
+          <wp:inline distT="0" distB="0" distL="57150" distR="57150">
+            <wp:extent cx="2765714" cy="1584000"/>
+            <wp:docPr id="516" name="Imagen 516"/>
+            <wp:cNvGraphicFramePr>
+              <a:graphicFrameLocks noChangeAspect="1"/>
+            </wp:cNvGraphicFramePr>
+            <a:graphic>
+              <a:graphicData uri="http://schemas.openxmlformats.org/drawingml/2006/picture">
+                <pic:pic>
+                  <pic:nvPicPr>
+                    <pic:cNvPr id="516" name="p2_916.jpeg"/>
+                    <pic:cNvPicPr/>
+                  </pic:nvPicPr>
+                  <pic:blipFill>
+                    <a:blip r:embed="rIdP2916"/>
+                    <a:stretch>
+                      <a:fillRect/>
+                    </a:stretch>
+                  </pic:blipFill>
+                  <pic:spPr>
+                    <a:xfrm>
+                      <a:off x="0" y="0"/>
+                      <a:ext cx="2765714" cy="1584000"/>
+                    </a:xfrm>
+                    <a:prstGeom prst="rect">
+                      <a:avLst/>
+                    </a:prstGeom>
+                  </pic:spPr>
+                </pic:pic>
+              </a:graphicData>
+            </a:graphic>
+          </wp:inline>
+        </w:drawing>
+      </w:r>
+    </w:p>
+    <w:p>
+      <w:pPr>
+        <w:spacing w:before="60" w:after="240"/>
+        <w:jc w:val="center"/>
+      </w:pPr>
+      <w:r>
+        <w:rPr>
+          <w:rFonts w:ascii="Arial" w:hAnsi="Arial" w:cs="Arial"/>
+          <w:b/>
+          <w:bCs/>
+          <w:i/>
+          <w:iCs/>
+          <w:color w:val="404040"/>
+          <w:sz w:val="20"/>
+          <w:szCs w:val="20"/>
+        </w:rPr>
+        <w:t xml:space="preserve">Figura 15.</w:t>
+      </w:r>
+      <w:r>
+        <w:rPr>
+          <w:rFonts w:ascii="Arial" w:hAnsi="Arial" w:cs="Arial"/>
+          <w:i/>
+          <w:iCs/>
+          <w:color w:val="404040"/>
+          <w:sz w:val="20"/>
+          <w:szCs w:val="20"/>
+        </w:rPr>
+        <w:t xml:space="preserve"> Izquierda: prólogo con imágenes. Derecha: diálogo con retrato y voz de un eco en el Ala de Aprendizaje.</w:t>
+      </w:r>
+    </w:p>
+    <w:p xmlns:a="http://schemas.openxmlformats.org/drawingml/2006/main" xmlns:pic="http://schemas.openxmlformats.org/drawingml/2006/picture">
+      <w:pPr>
+        <w:keepNext/>
+        <w:spacing w:before="120" w:after="0"/>
+        <w:jc w:val="center"/>
+      </w:pPr>
+      <w:r>
+        <w:drawing>
+          <wp:inline distT="0" distB="0" distL="57150" distR="57150">
+            <wp:extent cx="2757073" cy="1550853"/>
+            <wp:docPr id="517" name="Imagen 517"/>
+            <wp:cNvGraphicFramePr>
+              <a:graphicFrameLocks noChangeAspect="1"/>
+            </wp:cNvGraphicFramePr>
+            <a:graphic>
+              <a:graphicData uri="http://schemas.openxmlformats.org/drawingml/2006/picture">
+                <pic:pic>
+                  <pic:nvPicPr>
+                    <pic:cNvPr id="517" name="p2_917.jpeg"/>
+                    <pic:cNvPicPr/>
+                  </pic:nvPicPr>
+                  <pic:blipFill>
+                    <a:blip r:embed="rIdP2917"/>
+                    <a:stretch>
+                      <a:fillRect/>
+                    </a:stretch>
+                  </pic:blipFill>
+                  <pic:spPr>
+                    <a:xfrm>
+                      <a:off x="0" y="0"/>
+                      <a:ext cx="2757073" cy="1550853"/>
+                    </a:xfrm>
+                    <a:prstGeom prst="rect">
+                      <a:avLst/>
+                    </a:prstGeom>
+                  </pic:spPr>
+                </pic:pic>
+              </a:graphicData>
+            </a:graphic>
+          </wp:inline>
+        </w:drawing>
+      </w:r>
+      <w:r>
+        <w:drawing>
+          <wp:inline distT="0" distB="0" distL="57150" distR="57150">
+            <wp:extent cx="2894926" cy="1550853"/>
+            <wp:docPr id="518" name="Imagen 518"/>
+            <wp:cNvGraphicFramePr>
+              <a:graphicFrameLocks noChangeAspect="1"/>
+            </wp:cNvGraphicFramePr>
+            <a:graphic>
+              <a:graphicData uri="http://schemas.openxmlformats.org/drawingml/2006/picture">
+                <pic:pic>
+                  <pic:nvPicPr>
+                    <pic:cNvPr id="518" name="p2_918.jpeg"/>
+                    <pic:cNvPicPr/>
+                  </pic:nvPicPr>
+                  <pic:blipFill>
+                    <a:blip r:embed="rIdP2918"/>
+                    <a:stretch>
+                      <a:fillRect/>
+                    </a:stretch>
+                  </pic:blipFill>
+                  <pic:spPr>
+                    <a:xfrm>
+                      <a:off x="0" y="0"/>
+                      <a:ext cx="2894926" cy="1550853"/>
+                    </a:xfrm>
+                    <a:prstGeom prst="rect">
+                      <a:avLst/>
+                    </a:prstGeom>
+                  </pic:spPr>
+                </pic:pic>
+              </a:graphicData>
+            </a:graphic>
+          </wp:inline>
+        </w:drawing>
+      </w:r>
+    </w:p>
+    <w:p>
+      <w:pPr>
+        <w:spacing w:before="60" w:after="240"/>
+        <w:jc w:val="center"/>
+      </w:pPr>
+      <w:r>
+        <w:rPr>
+          <w:rFonts w:ascii="Arial" w:hAnsi="Arial" w:cs="Arial"/>
+          <w:b/>
+          <w:bCs/>
+          <w:i/>
+          <w:iCs/>
+          <w:color w:val="404040"/>
+          <w:sz w:val="20"/>
+          <w:szCs w:val="20"/>
+        </w:rPr>
+        <w:t xml:space="preserve">Figura 16.</w:t>
+      </w:r>
+      <w:r>
+        <w:rPr>
+          <w:rFonts w:ascii="Arial" w:hAnsi="Arial" w:cs="Arial"/>
+          <w:i/>
+          <w:iCs/>
+          <w:color w:val="404040"/>
+          <w:sz w:val="20"/>
+          <w:szCs w:val="20"/>
+        </w:rPr>
+        <w:t xml:space="preserve"> Izquierda: las orillas se ponen rojas al recibir daño y aparece el aviso del objeto recogido. Derecha: pantalla de resultados del Ala de Aprendizaje.</w:t>
+      </w:r>
+    </w:p>
+    <w:p xmlns:a="http://schemas.openxmlformats.org/drawingml/2006/main" xmlns:pic="http://schemas.openxmlformats.org/drawingml/2006/picture">
+      <w:pPr>
+        <w:keepNext/>
+        <w:spacing w:before="120" w:after="0"/>
+        <w:jc w:val="center"/>
+      </w:pPr>
+      <w:r>
+        <w:drawing>
+          <wp:inline distT="0" distB="0" distL="57150" distR="57150">
+            <wp:extent cx="2816000" cy="1584000"/>
+            <wp:docPr id="519" name="Imagen 519"/>
+            <wp:cNvGraphicFramePr>
+              <a:graphicFrameLocks noChangeAspect="1"/>
+            </wp:cNvGraphicFramePr>
+            <a:graphic>
+              <a:graphicData uri="http://schemas.openxmlformats.org/drawingml/2006/picture">
+                <pic:pic>
+                  <pic:nvPicPr>
+                    <pic:cNvPr id="519" name="p2_919.jpeg"/>
+                    <pic:cNvPicPr/>
+                  </pic:nvPicPr>
+                  <pic:blipFill>
+                    <a:blip r:embed="rIdP2919"/>
+                    <a:stretch>
+                      <a:fillRect/>
+                    </a:stretch>
+                  </pic:blipFill>
+                  <pic:spPr>
+                    <a:xfrm>
+                      <a:off x="0" y="0"/>
+                      <a:ext cx="2816000" cy="1584000"/>
+                    </a:xfrm>
+                    <a:prstGeom prst="rect">
+                      <a:avLst/>
+                    </a:prstGeom>
+                  </pic:spPr>
+                </pic:pic>
+              </a:graphicData>
+            </a:graphic>
+          </wp:inline>
+        </w:drawing>
+      </w:r>
+      <w:r>
+        <w:drawing>
+          <wp:inline distT="0" distB="0" distL="57150" distR="57150">
+            <wp:extent cx="2816000" cy="1584000"/>
+            <wp:docPr id="520" name="Imagen 520"/>
+            <wp:cNvGraphicFramePr>
+              <a:graphicFrameLocks noChangeAspect="1"/>
+            </wp:cNvGraphicFramePr>
+            <a:graphic>
+              <a:graphicData uri="http://schemas.openxmlformats.org/drawingml/2006/picture">
+                <pic:pic>
+                  <pic:nvPicPr>
+                    <pic:cNvPr id="520" name="p2_920.jpeg"/>
+                    <pic:cNvPicPr/>
+                  </pic:nvPicPr>
+                  <pic:blipFill>
+                    <a:blip r:embed="rIdP2920"/>
+                    <a:stretch>
+                      <a:fillRect/>
+                    </a:stretch>
+                  </pic:blipFill>
+                  <pic:spPr>
+                    <a:xfrm>
+                      <a:off x="0" y="0"/>
+                      <a:ext cx="2816000" cy="1584000"/>
+                    </a:xfrm>
+                    <a:prstGeom prst="rect">
+                      <a:avLst/>
+                    </a:prstGeom>
+                  </pic:spPr>
+                </pic:pic>
+              </a:graphicData>
+            </a:graphic>
+          </wp:inline>
+        </w:drawing>
+      </w:r>
+    </w:p>
+    <w:p>
+      <w:pPr>
+        <w:spacing w:before="60" w:after="240"/>
+        <w:jc w:val="center"/>
+      </w:pPr>
+      <w:r>
+        <w:rPr>
+          <w:rFonts w:ascii="Arial" w:hAnsi="Arial" w:cs="Arial"/>
+          <w:b/>
+          <w:bCs/>
+          <w:i/>
+          <w:iCs/>
+          <w:color w:val="404040"/>
+          <w:sz w:val="20"/>
+          <w:szCs w:val="20"/>
+        </w:rPr>
+        <w:t xml:space="preserve">Figura 17.</w:t>
+      </w:r>
+      <w:r>
+        <w:rPr>
+          <w:rFonts w:ascii="Arial" w:hAnsi="Arial" w:cs="Arial"/>
+          <w:i/>
+          <w:iCs/>
+          <w:color w:val="404040"/>
+          <w:sz w:val="20"/>
+          <w:szCs w:val="20"/>
+        </w:rPr>
+        <w:t xml:space="preserve"> Izquierda: combate contra un Centinela de Ceniza con su Lanza Incandescente. Derecha: proyección de la Maestra Sable con un consejo antes del guardián.</w:t>
+      </w:r>
+    </w:p>
+    <w:p xmlns:a="http://schemas.openxmlformats.org/drawingml/2006/main" xmlns:pic="http://schemas.openxmlformats.org/drawingml/2006/picture">
+      <w:pPr>
+        <w:keepNext/>
+        <w:spacing w:before="120" w:after="0"/>
+        <w:jc w:val="center"/>
+      </w:pPr>
+      <w:r>
+        <w:drawing>
+          <wp:inline distT="0" distB="0" distL="57150" distR="57150">
+            <wp:extent cx="2816000" cy="1584000"/>
+            <wp:docPr id="521" name="Imagen 521"/>
+            <wp:cNvGraphicFramePr>
+              <a:graphicFrameLocks noChangeAspect="1"/>
+            </wp:cNvGraphicFramePr>
+            <a:graphic>
+              <a:graphicData uri="http://schemas.openxmlformats.org/drawingml/2006/picture">
+                <pic:pic>
+                  <pic:nvPicPr>
+                    <pic:cNvPr id="521" name="p2_921.jpeg"/>
+                    <pic:cNvPicPr/>
+                  </pic:nvPicPr>
+                  <pic:blipFill>
+                    <a:blip r:embed="rIdP2921"/>
+                    <a:stretch>
+                      <a:fillRect/>
+                    </a:stretch>
+                  </pic:blipFill>
+                  <pic:spPr>
+                    <a:xfrm>
+                      <a:off x="0" y="0"/>
+                      <a:ext cx="2816000" cy="1584000"/>
+                    </a:xfrm>
+                    <a:prstGeom prst="rect">
+                      <a:avLst/>
+                    </a:prstGeom>
+                  </pic:spPr>
+                </pic:pic>
+              </a:graphicData>
+            </a:graphic>
+          </wp:inline>
+        </w:drawing>
+      </w:r>
+      <w:r>
+        <w:drawing>
+          <wp:inline distT="0" distB="0" distL="57150" distR="57150">
+            <wp:extent cx="2816000" cy="1584000"/>
+            <wp:docPr id="522" name="Imagen 522"/>
+            <wp:cNvGraphicFramePr>
+              <a:graphicFrameLocks noChangeAspect="1"/>
+            </wp:cNvGraphicFramePr>
+            <a:graphic>
+              <a:graphicData uri="http://schemas.openxmlformats.org/drawingml/2006/picture">
+                <pic:pic>
+                  <pic:nvPicPr>
+                    <pic:cNvPr id="522" name="p2_922.jpeg"/>
+                    <pic:cNvPicPr/>
+                  </pic:nvPicPr>
+                  <pic:blipFill>
+                    <a:blip r:embed="rIdP2922"/>
+                    <a:stretch>
+                      <a:fillRect/>
+                    </a:stretch>
+                  </pic:blipFill>
+                  <pic:spPr>
+                    <a:xfrm>
+                      <a:off x="0" y="0"/>
+                      <a:ext cx="2816000" cy="1584000"/>
+                    </a:xfrm>
+                    <a:prstGeom prst="rect">
+                      <a:avLst/>
+                    </a:prstGeom>
+                  </pic:spPr>
+                </pic:pic>
+              </a:graphicData>
+            </a:graphic>
+          </wp:inline>
+        </w:drawing>
+      </w:r>
+    </w:p>
+    <w:p>
+      <w:pPr>
+        <w:spacing w:before="60" w:after="240"/>
+        <w:jc w:val="center"/>
+      </w:pPr>
+      <w:r>
+        <w:rPr>
+          <w:rFonts w:ascii="Arial" w:hAnsi="Arial" w:cs="Arial"/>
+          <w:b/>
+          <w:bCs/>
+          <w:i/>
+          <w:iCs/>
+          <w:color w:val="404040"/>
+          <w:sz w:val="20"/>
+          <w:szCs w:val="20"/>
+        </w:rPr>
+        <w:t xml:space="preserve">Figura 18.</w:t>
+      </w:r>
+      <w:r>
+        <w:rPr>
+          <w:rFonts w:ascii="Arial" w:hAnsi="Arial" w:cs="Arial"/>
+          <w:i/>
+          <w:iCs/>
+          <w:color w:val="404040"/>
+          <w:sz w:val="20"/>
+          <w:szCs w:val="20"/>
+        </w:rPr>
+        <w:t xml:space="preserve"> Izquierda: batalla contra Kaelor con su barra de vida. Derecha: Página Perdida recogida (+5 de vida máxima).</w:t>
+      </w:r>
+    </w:p>
+    <w:p xmlns:a="http://schemas.openxmlformats.org/drawingml/2006/main" xmlns:pic="http://schemas.openxmlformats.org/drawingml/2006/picture">
+      <w:pPr>
+        <w:keepNext/>
+        <w:spacing w:before="120" w:after="0"/>
+        <w:jc w:val="center"/>
+      </w:pPr>
+      <w:r>
+        <w:drawing>
+          <wp:inline distT="0" distB="0" distL="57150" distR="57150">
+            <wp:extent cx="2679746" cy="1507357"/>
+            <wp:docPr id="523" name="Imagen 523"/>
+            <wp:cNvGraphicFramePr>
+              <a:graphicFrameLocks noChangeAspect="1"/>
+            </wp:cNvGraphicFramePr>
+            <a:graphic>
+              <a:graphicData uri="http://schemas.openxmlformats.org/drawingml/2006/picture">
+                <pic:pic>
+                  <pic:nvPicPr>
+                    <pic:cNvPr id="523" name="p2_923.jpeg"/>
+                    <pic:cNvPicPr/>
+                  </pic:nvPicPr>
+                  <pic:blipFill>
+                    <a:blip r:embed="rIdP2923"/>
+                    <a:stretch>
+                      <a:fillRect/>
+                    </a:stretch>
+                  </pic:blipFill>
+                  <pic:spPr>
+                    <a:xfrm>
+                      <a:off x="0" y="0"/>
+                      <a:ext cx="2679746" cy="1507357"/>
+                    </a:xfrm>
+                    <a:prstGeom prst="rect">
+                      <a:avLst/>
+                    </a:prstGeom>
+                  </pic:spPr>
+                </pic:pic>
+              </a:graphicData>
+            </a:graphic>
+          </wp:inline>
+        </w:drawing>
+      </w:r>
+      <w:r>
+        <w:drawing>
+          <wp:inline distT="0" distB="0" distL="57150" distR="57150">
+            <wp:extent cx="2972253" cy="1507357"/>
+            <wp:docPr id="524" name="Imagen 524"/>
+            <wp:cNvGraphicFramePr>
+              <a:graphicFrameLocks noChangeAspect="1"/>
+            </wp:cNvGraphicFramePr>
+            <a:graphic>
+              <a:graphicData uri="http://schemas.openxmlformats.org/drawingml/2006/picture">
+                <pic:pic>
+                  <pic:nvPicPr>
+                    <pic:cNvPr id="524" name="p2_924.jpeg"/>
+                    <pic:cNvPicPr/>
+                  </pic:nvPicPr>
+                  <pic:blipFill>
+                    <a:blip r:embed="rIdP2924"/>
+                    <a:stretch>
+                      <a:fillRect/>
+                    </a:stretch>
+                  </pic:blipFill>
+                  <pic:spPr>
+                    <a:xfrm>
+                      <a:off x="0" y="0"/>
+                      <a:ext cx="2972253" cy="1507357"/>
+                    </a:xfrm>
+                    <a:prstGeom prst="rect">
+                      <a:avLst/>
+                    </a:prstGeom>
+                  </pic:spPr>
+                </pic:pic>
+              </a:graphicData>
+            </a:graphic>
+          </wp:inline>
+        </w:drawing>
+      </w:r>
+    </w:p>
+    <w:p>
+      <w:pPr>
+        <w:spacing w:before="60" w:after="240"/>
+        <w:jc w:val="center"/>
+      </w:pPr>
+      <w:r>
+        <w:rPr>
+          <w:rFonts w:ascii="Arial" w:hAnsi="Arial" w:cs="Arial"/>
+          <w:b/>
+          <w:bCs/>
+          <w:i/>
+          <w:iCs/>
+          <w:color w:val="404040"/>
+          <w:sz w:val="20"/>
+          <w:szCs w:val="20"/>
+        </w:rPr>
+        <w:t xml:space="preserve">Figura 19.</w:t>
+      </w:r>
+      <w:r>
+        <w:rPr>
+          <w:rFonts w:ascii="Arial" w:hAnsi="Arial" w:cs="Arial"/>
+          <w:i/>
+          <w:iCs/>
+          <w:color w:val="404040"/>
+          <w:sz w:val="20"/>
+          <w:szCs w:val="20"/>
+        </w:rPr>
+        <w:t xml:space="preserve"> Izquierda: Fragmento de Grimorio II con un texto de Elenora. Derecha: resultados del Ala de Fuego y logro Sin Un Rasguño.</w:t>
+      </w:r>
+    </w:p>
+    <w:p xmlns:a="http://schemas.openxmlformats.org/drawingml/2006/main" xmlns:pic="http://schemas.openxmlformats.org/drawingml/2006/picture">
+      <w:pPr>
+        <w:keepNext/>
+        <w:spacing w:before="120" w:after="0"/>
+        <w:jc w:val="center"/>
+      </w:pPr>
+      <w:r>
+        <w:drawing>
+          <wp:inline distT="0" distB="0" distL="57150" distR="57150">
+            <wp:extent cx="2816000" cy="1584000"/>
+            <wp:docPr id="525" name="Imagen 525"/>
+            <wp:cNvGraphicFramePr>
+              <a:graphicFrameLocks noChangeAspect="1"/>
+            </wp:cNvGraphicFramePr>
+            <a:graphic>
+              <a:graphicData uri="http://schemas.openxmlformats.org/drawingml/2006/picture">
+                <pic:pic>
+                  <pic:nvPicPr>
+                    <pic:cNvPr id="525" name="p2_925.jpeg"/>
+                    <pic:cNvPicPr/>
+                  </pic:nvPicPr>
+                  <pic:blipFill>
+                    <a:blip r:embed="rIdP2925"/>
+                    <a:stretch>
+                      <a:fillRect/>
+                    </a:stretch>
+                  </pic:blipFill>
+                  <pic:spPr>
+                    <a:xfrm>
+                      <a:off x="0" y="0"/>
+                      <a:ext cx="2816000" cy="1584000"/>
+                    </a:xfrm>
+                    <a:prstGeom prst="rect">
+                      <a:avLst/>
+                    </a:prstGeom>
+                  </pic:spPr>
+                </pic:pic>
+              </a:graphicData>
+            </a:graphic>
+          </wp:inline>
+        </w:drawing>
+      </w:r>
+      <w:r>
+        <w:drawing>
+          <wp:inline distT="0" distB="0" distL="57150" distR="57150">
+            <wp:extent cx="2816000" cy="1584000"/>
+            <wp:docPr id="526" name="Imagen 526"/>
+            <wp:cNvGraphicFramePr>
+              <a:graphicFrameLocks noChangeAspect="1"/>
+            </wp:cNvGraphicFramePr>
+            <a:graphic>
+              <a:graphicData uri="http://schemas.openxmlformats.org/drawingml/2006/picture">
+                <pic:pic>
+                  <pic:nvPicPr>
+                    <pic:cNvPr id="526" name="p2_926.jpeg"/>
+                    <pic:cNvPicPr/>
+                  </pic:nvPicPr>
+                  <pic:blipFill>
+                    <a:blip r:embed="rIdP2926"/>
+                    <a:stretch>
+                      <a:fillRect/>
+                    </a:stretch>
+                  </pic:blipFill>
+                  <pic:spPr>
+                    <a:xfrm>
+                      <a:off x="0" y="0"/>
+                      <a:ext cx="2816000" cy="1584000"/>
+                    </a:xfrm>
+                    <a:prstGeom prst="rect">
+                      <a:avLst/>
+                    </a:prstGeom>
+                  </pic:spPr>
+                </pic:pic>
+              </a:graphicData>
+            </a:graphic>
+          </wp:inline>
+        </w:drawing>
+      </w:r>
+    </w:p>
+    <w:p>
+      <w:pPr>
+        <w:spacing w:before="60" w:after="240"/>
+        <w:jc w:val="center"/>
+      </w:pPr>
+      <w:r>
+        <w:rPr>
+          <w:rFonts w:ascii="Arial" w:hAnsi="Arial" w:cs="Arial"/>
+          <w:b/>
+          <w:bCs/>
+          <w:i/>
+          <w:iCs/>
+          <w:color w:val="404040"/>
+          <w:sz w:val="20"/>
+          <w:szCs w:val="20"/>
+        </w:rPr>
+        <w:t xml:space="preserve">Figura 20.</w:t>
+      </w:r>
+      <w:r>
+        <w:rPr>
+          <w:rFonts w:ascii="Arial" w:hAnsi="Arial" w:cs="Arial"/>
+          <w:i/>
+          <w:iCs/>
+          <w:color w:val="404040"/>
+          <w:sz w:val="20"/>
+          <w:szCs w:val="20"/>
+        </w:rPr>
+        <w:t xml:space="preserve"> Izquierda: entrada al Ala de Hielo con el pensamiento de Lira. Derecha: batalla contra Isolde.</w:t>
+      </w:r>
+    </w:p>
+    <w:p xmlns:a="http://schemas.openxmlformats.org/drawingml/2006/main" xmlns:pic="http://schemas.openxmlformats.org/drawingml/2006/picture">
+      <w:pPr>
+        <w:keepNext/>
+        <w:spacing w:before="120" w:after="0"/>
+        <w:jc w:val="center"/>
+      </w:pPr>
+      <w:r>
+        <w:drawing>
+          <wp:inline distT="0" distB="0" distL="57150" distR="57150">
+            <wp:extent cx="2816000" cy="1584000"/>
+            <wp:docPr id="527" name="Imagen 527"/>
+            <wp:cNvGraphicFramePr>
+              <a:graphicFrameLocks noChangeAspect="1"/>
+            </wp:cNvGraphicFramePr>
+            <a:graphic>
+              <a:graphicData uri="http://schemas.openxmlformats.org/drawingml/2006/picture">
+                <pic:pic>
+                  <pic:nvPicPr>
+                    <pic:cNvPr id="527" name="p2_927.jpeg"/>
+                    <pic:cNvPicPr/>
+                  </pic:nvPicPr>
+                  <pic:blipFill>
+                    <a:blip r:embed="rIdP2927"/>
+                    <a:stretch>
+                      <a:fillRect/>
+                    </a:stretch>
+                  </pic:blipFill>
+                  <pic:spPr>
+                    <a:xfrm>
+                      <a:off x="0" y="0"/>
+                      <a:ext cx="2816000" cy="1584000"/>
+                    </a:xfrm>
+                    <a:prstGeom prst="rect">
+                      <a:avLst/>
+                    </a:prstGeom>
+                  </pic:spPr>
+                </pic:pic>
+              </a:graphicData>
+            </a:graphic>
+          </wp:inline>
+        </w:drawing>
+      </w:r>
+      <w:r>
+        <w:drawing>
+          <wp:inline distT="0" distB="0" distL="57150" distR="57150">
+            <wp:extent cx="2816000" cy="1584000"/>
+            <wp:docPr id="528" name="Imagen 528"/>
+            <wp:cNvGraphicFramePr>
+              <a:graphicFrameLocks noChangeAspect="1"/>
+            </wp:cNvGraphicFramePr>
+            <a:graphic>
+              <a:graphicData uri="http://schemas.openxmlformats.org/drawingml/2006/picture">
+                <pic:pic>
+                  <pic:nvPicPr>
+                    <pic:cNvPr id="528" name="p2_928.jpeg"/>
+                    <pic:cNvPicPr/>
+                  </pic:nvPicPr>
+                  <pic:blipFill>
+                    <a:blip r:embed="rIdP2928"/>
+                    <a:stretch>
+                      <a:fillRect/>
+                    </a:stretch>
+                  </pic:blipFill>
+                  <pic:spPr>
+                    <a:xfrm>
+                      <a:off x="0" y="0"/>
+                      <a:ext cx="2816000" cy="1584000"/>
+                    </a:xfrm>
+                    <a:prstGeom prst="rect">
+                      <a:avLst/>
+                    </a:prstGeom>
+                  </pic:spPr>
+                </pic:pic>
+              </a:graphicData>
+            </a:graphic>
+          </wp:inline>
+        </w:drawing>
+      </w:r>
+    </w:p>
+    <w:p>
+      <w:pPr>
+        <w:spacing w:before="60" w:after="240"/>
+        <w:jc w:val="center"/>
+      </w:pPr>
+      <w:r>
+        <w:rPr>
+          <w:rFonts w:ascii="Arial" w:hAnsi="Arial" w:cs="Arial"/>
+          <w:b/>
+          <w:bCs/>
+          <w:i/>
+          <w:iCs/>
+          <w:color w:val="404040"/>
+          <w:sz w:val="20"/>
+          <w:szCs w:val="20"/>
+        </w:rPr>
+        <w:t xml:space="preserve">Figura 21.</w:t>
+      </w:r>
+      <w:r>
+        <w:rPr>
+          <w:rFonts w:ascii="Arial" w:hAnsi="Arial" w:cs="Arial"/>
+          <w:i/>
+          <w:iCs/>
+          <w:color w:val="404040"/>
+          <w:sz w:val="20"/>
+          <w:szCs w:val="20"/>
+        </w:rPr>
+        <w:t xml:space="preserve"> Izquierda: consejo de la Maestra Sable antes de Isolde. Derecha: resultados del Ala de Hielo con el nuevo hechizo de Viento.</w:t>
+      </w:r>
+    </w:p>
+    <w:p>
+      <w:pPr>
+        <w:pStyle w:val="Ttulo1"/>
+        <w:keepNext/>
+        <w:spacing w:before="280" w:after="120"/>
+        <w:outlineLvl w:val="1"/>
+      </w:pPr>
+      <w:bookmarkStart w:id="919" w:name="_TocP2019"/>
+      <w:r>
+        <w:rPr>
+          <w:rFonts w:cs="Arial"/>
+          <w:sz w:val="28"/>
+          <w:szCs w:val="28"/>
+        </w:rPr>
+        <w:t>4.5 Interfaces implementadas</w:t>
+      </w:r>
+      <w:bookmarkEnd w:id="919"/>
     </w:p>
     <w:p>
       <w:pPr>
@@ -23300,16 +24170,16 @@
         <w:spacing w:before="280" w:after="120"/>
         <w:outlineLvl w:val="1"/>
       </w:pPr>
-      <w:bookmarkStart w:id="919" w:name="_TocP2019"/>
+      <w:bookmarkStart w:id="920" w:name="_TocP2020"/>
       <w:r>
         <w:rPr>
           <w:rFonts w:cs="Arial"/>
           <w:sz w:val="28"/>
           <w:szCs w:val="28"/>
         </w:rPr>
-        <w:t>4.5 Habilidades elementales y acertijos</w:t>
+        <w:t>4.6 Habilidades elementales y acertijos</w:t>
       </w:r>
-      <w:bookmarkEnd w:id="919"/>
+      <w:bookmarkEnd w:id="920"/>
     </w:p>
     <w:p>
       <w:pPr>
@@ -23845,7 +24715,7 @@
         <w:drawing>
           <wp:inline distT="0" distB="0" distL="57150" distR="57150">
             <wp:extent cx="1296000" cy="1296000"/>
-            <wp:docPr id="515" name="Imagen 515"/>
+            <wp:docPr id="529" name="Imagen 529"/>
             <wp:cNvGraphicFramePr>
               <a:graphicFrameLocks noChangeAspect="1"/>
             </wp:cNvGraphicFramePr>
@@ -23853,11 +24723,11 @@
               <a:graphicData uri="http://schemas.openxmlformats.org/drawingml/2006/picture">
                 <pic:pic>
                   <pic:nvPicPr>
-                    <pic:cNvPr id="515" name="p2_915.png"/>
+                    <pic:cNvPr id="529" name="p2_929.png"/>
                     <pic:cNvPicPr/>
                   </pic:nvPicPr>
                   <pic:blipFill>
-                    <a:blip r:embed="rIdP2915"/>
+                    <a:blip r:embed="rIdP2929"/>
                     <a:stretch>
                       <a:fillRect/>
                     </a:stretch>
@@ -23881,7 +24751,7 @@
         <w:drawing>
           <wp:inline distT="0" distB="0" distL="57150" distR="57150">
             <wp:extent cx="1296000" cy="1296000"/>
-            <wp:docPr id="516" name="Imagen 516"/>
+            <wp:docPr id="530" name="Imagen 530"/>
             <wp:cNvGraphicFramePr>
               <a:graphicFrameLocks noChangeAspect="1"/>
             </wp:cNvGraphicFramePr>
@@ -23889,11 +24759,11 @@
               <a:graphicData uri="http://schemas.openxmlformats.org/drawingml/2006/picture">
                 <pic:pic>
                   <pic:nvPicPr>
-                    <pic:cNvPr id="516" name="p2_916.png"/>
+                    <pic:cNvPr id="530" name="p2_930.png"/>
                     <pic:cNvPicPr/>
                   </pic:nvPicPr>
                   <pic:blipFill>
-                    <a:blip r:embed="rIdP2916"/>
+                    <a:blip r:embed="rIdP2930"/>
                     <a:stretch>
                       <a:fillRect/>
                     </a:stretch>
@@ -23917,7 +24787,7 @@
         <w:drawing>
           <wp:inline distT="0" distB="0" distL="57150" distR="57150">
             <wp:extent cx="1296000" cy="1296000"/>
-            <wp:docPr id="517" name="Imagen 517"/>
+            <wp:docPr id="531" name="Imagen 531"/>
             <wp:cNvGraphicFramePr>
               <a:graphicFrameLocks noChangeAspect="1"/>
             </wp:cNvGraphicFramePr>
@@ -23925,11 +24795,11 @@
               <a:graphicData uri="http://schemas.openxmlformats.org/drawingml/2006/picture">
                 <pic:pic>
                   <pic:nvPicPr>
-                    <pic:cNvPr id="517" name="p2_917.png"/>
+                    <pic:cNvPr id="531" name="p2_931.png"/>
                     <pic:cNvPicPr/>
                   </pic:nvPicPr>
                   <pic:blipFill>
-                    <a:blip r:embed="rIdP2917"/>
+                    <a:blip r:embed="rIdP2931"/>
                     <a:stretch>
                       <a:fillRect/>
                     </a:stretch>
@@ -23953,7 +24823,7 @@
         <w:drawing>
           <wp:inline distT="0" distB="0" distL="57150" distR="57150">
             <wp:extent cx="1296000" cy="1296000"/>
-            <wp:docPr id="518" name="Imagen 518"/>
+            <wp:docPr id="532" name="Imagen 532"/>
             <wp:cNvGraphicFramePr>
               <a:graphicFrameLocks noChangeAspect="1"/>
             </wp:cNvGraphicFramePr>
@@ -23961,11 +24831,11 @@
               <a:graphicData uri="http://schemas.openxmlformats.org/drawingml/2006/picture">
                 <pic:pic>
                   <pic:nvPicPr>
-                    <pic:cNvPr id="518" name="p2_918.png"/>
+                    <pic:cNvPr id="532" name="p2_932.png"/>
                     <pic:cNvPicPr/>
                   </pic:nvPicPr>
                   <pic:blipFill>
-                    <a:blip r:embed="rIdP2918"/>
+                    <a:blip r:embed="rIdP2932"/>
                     <a:stretch>
                       <a:fillRect/>
                     </a:stretch>
@@ -24002,7 +24872,7 @@
           <w:sz w:val="20"/>
           <w:szCs w:val="20"/>
         </w:rPr>
-        <w:t xml:space="preserve">Figura 15.</w:t>
+        <w:t xml:space="preserve">Figura 22.</w:t>
       </w:r>
       <w:r>
         <w:rPr>
@@ -24023,16 +24893,16 @@
         <w:spacing w:before="280" w:after="120"/>
         <w:outlineLvl w:val="1"/>
       </w:pPr>
-      <w:bookmarkStart w:id="920" w:name="_TocP2020"/>
+      <w:bookmarkStart w:id="921" w:name="_TocP2021"/>
       <w:r>
         <w:rPr>
           <w:rFonts w:cs="Arial"/>
           <w:sz w:val="28"/>
           <w:szCs w:val="28"/>
         </w:rPr>
-        <w:t>4.6 Audio</w:t>
+        <w:t>4.7 Audio</w:t>
       </w:r>
-      <w:bookmarkEnd w:id="920"/>
+      <w:bookmarkEnd w:id="921"/>
     </w:p>
     <w:p>
       <w:pPr>
@@ -24056,16 +24926,16 @@
         <w:spacing w:before="280" w:after="120"/>
         <w:outlineLvl w:val="1"/>
       </w:pPr>
-      <w:bookmarkStart w:id="921" w:name="_TocP2021"/>
+      <w:bookmarkStart w:id="922" w:name="_TocP2022"/>
       <w:r>
         <w:rPr>
           <w:rFonts w:cs="Arial"/>
           <w:sz w:val="28"/>
           <w:szCs w:val="28"/>
         </w:rPr>
-        <w:t>4.7 Herramientas de editor</w:t>
+        <w:t>4.8 Herramientas de editor</w:t>
       </w:r>
-      <w:bookmarkEnd w:id="921"/>
+      <w:bookmarkEnd w:id="922"/>
     </w:p>
     <w:p>
       <w:pPr>
@@ -24229,7 +25099,7 @@
         <w:spacing w:before="360" w:after="120"/>
         <w:outlineLvl w:val="0"/>
       </w:pPr>
-      <w:bookmarkStart w:id="922" w:name="_TocP2022"/>
+      <w:bookmarkStart w:id="923" w:name="_TocP2023"/>
       <w:r>
         <w:rPr>
           <w:rFonts w:cs="Arial"/>
@@ -24238,7 +25108,7 @@
         </w:rPr>
         <w:t>5. Pruebas Alfa</w:t>
       </w:r>
-      <w:bookmarkEnd w:id="922"/>
+      <w:bookmarkEnd w:id="923"/>
     </w:p>
     <w:p>
       <w:pPr>
@@ -24262,7 +25132,7 @@
         <w:spacing w:before="280" w:after="120"/>
         <w:outlineLvl w:val="1"/>
       </w:pPr>
-      <w:bookmarkStart w:id="923" w:name="_TocP2023"/>
+      <w:bookmarkStart w:id="924" w:name="_TocP2024"/>
       <w:r>
         <w:rPr>
           <w:rFonts w:cs="Arial"/>
@@ -24271,7 +25141,7 @@
         </w:rPr>
         <w:t>5.1 Casos de prueba</w:t>
       </w:r>
-      <w:bookmarkEnd w:id="923"/>
+      <w:bookmarkEnd w:id="924"/>
     </w:p>
     <w:p>
       <w:pPr>
@@ -26460,7 +27330,7 @@
         <w:spacing w:before="280" w:after="120"/>
         <w:outlineLvl w:val="1"/>
       </w:pPr>
-      <w:bookmarkStart w:id="924" w:name="_TocP2024"/>
+      <w:bookmarkStart w:id="925" w:name="_TocP2025"/>
       <w:r>
         <w:rPr>
           <w:rFonts w:cs="Arial"/>
@@ -26469,7 +27339,7 @@
         </w:rPr>
         <w:t>5.2 Buglist</w:t>
       </w:r>
-      <w:bookmarkEnd w:id="924"/>
+      <w:bookmarkEnd w:id="925"/>
     </w:p>
     <w:p>
       <w:pPr>
@@ -28558,7 +29428,7 @@
         <w:spacing w:before="360" w:after="120"/>
         <w:outlineLvl w:val="0"/>
       </w:pPr>
-      <w:bookmarkStart w:id="925" w:name="_TocP2025"/>
+      <w:bookmarkStart w:id="926" w:name="_TocP2026"/>
       <w:r>
         <w:rPr>
           <w:rFonts w:cs="Arial"/>
@@ -28567,7 +29437,7 @@
         </w:rPr>
         <w:t>6. Sprint Review</w:t>
       </w:r>
-      <w:bookmarkEnd w:id="925"/>
+      <w:bookmarkEnd w:id="926"/>
     </w:p>
     <w:p>
       <w:pPr>
@@ -29314,7 +30184,7 @@
         <w:spacing w:before="360" w:after="120"/>
         <w:outlineLvl w:val="0"/>
       </w:pPr>
-      <w:bookmarkStart w:id="926" w:name="_TocP2026"/>
+      <w:bookmarkStart w:id="927" w:name="_TocP2027"/>
       <w:r>
         <w:rPr>
           <w:rFonts w:cs="Arial"/>
@@ -29323,7 +30193,7 @@
         </w:rPr>
         <w:t>7. Presupuesto y licencia</w:t>
       </w:r>
-      <w:bookmarkEnd w:id="926"/>
+      <w:bookmarkEnd w:id="927"/>
     </w:p>
     <w:p>
       <w:pPr>
@@ -29332,7 +30202,7 @@
         <w:spacing w:before="280" w:after="120"/>
         <w:outlineLvl w:val="1"/>
       </w:pPr>
-      <w:bookmarkStart w:id="927" w:name="_TocP2027"/>
+      <w:bookmarkStart w:id="928" w:name="_TocP2028"/>
       <w:r>
         <w:rPr>
           <w:rFonts w:cs="Arial"/>
@@ -29341,7 +30211,7 @@
         </w:rPr>
         <w:t>7.1 Presupuesto</w:t>
       </w:r>
-      <w:bookmarkEnd w:id="927"/>
+      <w:bookmarkEnd w:id="928"/>
     </w:p>
     <w:p>
       <w:pPr>
@@ -30144,7 +31014,7 @@
         <w:spacing w:before="280" w:after="120"/>
         <w:outlineLvl w:val="1"/>
       </w:pPr>
-      <w:bookmarkStart w:id="928" w:name="_TocP2028"/>
+      <w:bookmarkStart w:id="929" w:name="_TocP2029"/>
       <w:r>
         <w:rPr>
           <w:rFonts w:cs="Arial"/>
@@ -30153,7 +31023,7 @@
         </w:rPr>
         <w:t>7.2 Licencia y propiedad intelectual</w:t>
       </w:r>
-      <w:bookmarkEnd w:id="928"/>
+      <w:bookmarkEnd w:id="929"/>
     </w:p>
     <w:p>
       <w:pPr>
@@ -30257,7 +31127,7 @@
         <w:spacing w:before="360" w:after="120"/>
         <w:outlineLvl w:val="0"/>
       </w:pPr>
-      <w:bookmarkStart w:id="929" w:name="_TocP2029"/>
+      <w:bookmarkStart w:id="930" w:name="_TocP2030"/>
       <w:r>
         <w:rPr>
           <w:rFonts w:cs="Arial"/>
@@ -30266,7 +31136,7 @@
         </w:rPr>
         <w:t>8. Plan para el Sprint 3</w:t>
       </w:r>
-      <w:bookmarkEnd w:id="929"/>
+      <w:bookmarkEnd w:id="930"/>
     </w:p>
     <w:p>
       <w:pPr>
@@ -30439,7 +31309,7 @@
         <w:spacing w:after="200"/>
         <w:outlineLvl w:val="0"/>
       </w:pPr>
-      <w:bookmarkStart w:id="930" w:name="_TocP2030"/>
+      <w:bookmarkStart w:id="931" w:name="_TocP2031"/>
       <w:r>
         <w:rPr>
           <w:rFonts w:cs="Arial"/>
@@ -30448,7 +31318,7 @@
         </w:rPr>
         <w:t>Conclusión</w:t>
       </w:r>
-      <w:bookmarkEnd w:id="930"/>
+      <w:bookmarkEnd w:id="931"/>
     </w:p>
     <w:p>
       <w:pPr>
@@ -30486,7 +31356,7 @@
         <w:spacing w:after="200"/>
         <w:outlineLvl w:val="0"/>
       </w:pPr>
-      <w:bookmarkStart w:id="931" w:name="_TocP2031"/>
+      <w:bookmarkStart w:id="932" w:name="_TocP2032"/>
       <w:r>
         <w:rPr>
           <w:rFonts w:cs="Arial"/>
@@ -30495,7 +31365,7 @@
         </w:rPr>
         <w:t>Referencias</w:t>
       </w:r>
-      <w:bookmarkEnd w:id="931"/>
+      <w:bookmarkEnd w:id="932"/>
     </w:p>
     <w:p>
       <w:pPr>

</xml_diff>